<commit_message>
Tambah Tabel 10 (Statistik Uji Terbatas & Luas) dan Tabel 11 (Angket Respon Siswa)
</commit_message>
<xml_diff>
--- a/JURNAL SKRIPSI ARUNI LENGKAP BAG 3-4.docx
+++ b/JURNAL SKRIPSI ARUNI LENGKAP BAG 3-4.docx
@@ -5567,6 +5567,1859 @@
         <w:t>Keterangan: N-Gain &lt; 0,30 = Rendah; 0,30 ≤ N-Gain &lt; 0,70 = Sedang; N-Gain ≥ 0,70 = Tinggi</w:t>
       </w:r>
     </w:p>
+    <w:p>
+      <w:r>
+        <w:br w:type="page"/>
+      </w:r>
+    </w:p>
+    <w:p>
+      <w:pPr>
+        <w:spacing w:before="120" w:after="60"/>
+      </w:pPr>
+      <w:r>
+        <w:rPr>
+          <w:rFonts w:ascii="Times New Roman" w:hAnsi="Times New Roman"/>
+          <w:b/>
+          <w:sz w:val="22"/>
+        </w:rPr>
+        <w:t>Gambar/Grafik</w:t>
+      </w:r>
+    </w:p>
+    <w:p/>
+    <w:p>
+      <w:pPr>
+        <w:jc w:val="center"/>
+      </w:pPr>
+      <w:r>
+        <w:rPr>
+          <w:rFonts w:ascii="Times New Roman" w:hAnsi="Times New Roman"/>
+          <w:b/>
+          <w:sz w:val="20"/>
+        </w:rPr>
+        <w:t>Tabel 10. Rekapitulasi Hasil Statistik Uji Coba Terbatas (10 Siswa) dan Uji Coba Luas (30 Siswa)</w:t>
+      </w:r>
+    </w:p>
+    <w:tbl>
+      <w:tblPr>
+        <w:tblStyle w:val="KisiTabel"/>
+        <w:tblW w:type="auto" w:w="0"/>
+        <w:tblLook w:firstColumn="1" w:firstRow="1" w:lastColumn="0" w:lastRow="0" w:noHBand="0" w:noVBand="1" w:val="04A0"/>
+      </w:tblPr>
+      <w:tblGrid>
+        <w:gridCol w:w="2197"/>
+        <w:gridCol w:w="2197"/>
+        <w:gridCol w:w="2197"/>
+        <w:gridCol w:w="2197"/>
+      </w:tblGrid>
+      <w:tr>
+        <w:tc>
+          <w:tcPr>
+            <w:tcW w:type="dxa" w:w="2197"/>
+          </w:tcPr>
+          <w:p>
+            <w:pPr>
+              <w:jc w:val="center"/>
+            </w:pPr>
+            <w:r/>
+            <w:r>
+              <w:rPr>
+                <w:rFonts w:ascii="Times New Roman" w:hAnsi="Times New Roman"/>
+                <w:b/>
+                <w:sz w:val="20"/>
+              </w:rPr>
+              <w:t>No.</w:t>
+            </w:r>
+          </w:p>
+        </w:tc>
+        <w:tc>
+          <w:tcPr>
+            <w:tcW w:type="dxa" w:w="2197"/>
+          </w:tcPr>
+          <w:p>
+            <w:pPr>
+              <w:jc w:val="center"/>
+            </w:pPr>
+            <w:r/>
+            <w:r>
+              <w:rPr>
+                <w:rFonts w:ascii="Times New Roman" w:hAnsi="Times New Roman"/>
+                <w:b/>
+                <w:sz w:val="20"/>
+              </w:rPr>
+              <w:t>Aspek Statistik</w:t>
+            </w:r>
+          </w:p>
+        </w:tc>
+        <w:tc>
+          <w:tcPr>
+            <w:tcW w:type="dxa" w:w="2197"/>
+          </w:tcPr>
+          <w:p>
+            <w:pPr>
+              <w:jc w:val="center"/>
+            </w:pPr>
+            <w:r/>
+            <w:r>
+              <w:rPr>
+                <w:rFonts w:ascii="Times New Roman" w:hAnsi="Times New Roman"/>
+                <w:b/>
+                <w:sz w:val="20"/>
+              </w:rPr>
+              <w:t>Uji Terbatas</w:t>
+              <w:br/>
+              <w:t>(n = 10)</w:t>
+            </w:r>
+          </w:p>
+        </w:tc>
+        <w:tc>
+          <w:tcPr>
+            <w:tcW w:type="dxa" w:w="2197"/>
+          </w:tcPr>
+          <w:p>
+            <w:pPr>
+              <w:jc w:val="center"/>
+            </w:pPr>
+            <w:r/>
+            <w:r>
+              <w:rPr>
+                <w:rFonts w:ascii="Times New Roman" w:hAnsi="Times New Roman"/>
+                <w:b/>
+                <w:sz w:val="20"/>
+              </w:rPr>
+              <w:t>Uji Luas</w:t>
+              <w:br/>
+              <w:t>(n = 30)</w:t>
+            </w:r>
+          </w:p>
+        </w:tc>
+      </w:tr>
+      <w:tr>
+        <w:tc>
+          <w:tcPr>
+            <w:tcW w:type="dxa" w:w="2197"/>
+          </w:tcPr>
+          <w:p>
+            <w:pPr>
+              <w:jc w:val="center"/>
+            </w:pPr>
+            <w:r/>
+            <w:r>
+              <w:rPr>
+                <w:rFonts w:ascii="Times New Roman" w:hAnsi="Times New Roman"/>
+                <w:b w:val="0"/>
+                <w:sz w:val="20"/>
+              </w:rPr>
+              <w:t>1</w:t>
+            </w:r>
+          </w:p>
+        </w:tc>
+        <w:tc>
+          <w:tcPr>
+            <w:tcW w:type="dxa" w:w="2197"/>
+          </w:tcPr>
+          <w:p>
+            <w:r/>
+            <w:r>
+              <w:rPr>
+                <w:rFonts w:ascii="Times New Roman" w:hAnsi="Times New Roman"/>
+                <w:b w:val="0"/>
+                <w:sz w:val="20"/>
+              </w:rPr>
+              <w:t>Jumlah Responden (N)</w:t>
+            </w:r>
+          </w:p>
+        </w:tc>
+        <w:tc>
+          <w:tcPr>
+            <w:tcW w:type="dxa" w:w="2197"/>
+          </w:tcPr>
+          <w:p>
+            <w:pPr>
+              <w:jc w:val="center"/>
+            </w:pPr>
+            <w:r/>
+            <w:r>
+              <w:rPr>
+                <w:rFonts w:ascii="Times New Roman" w:hAnsi="Times New Roman"/>
+                <w:b w:val="0"/>
+                <w:sz w:val="20"/>
+              </w:rPr>
+              <w:t>10</w:t>
+            </w:r>
+          </w:p>
+        </w:tc>
+        <w:tc>
+          <w:tcPr>
+            <w:tcW w:type="dxa" w:w="2197"/>
+          </w:tcPr>
+          <w:p>
+            <w:pPr>
+              <w:jc w:val="center"/>
+            </w:pPr>
+            <w:r/>
+            <w:r>
+              <w:rPr>
+                <w:rFonts w:ascii="Times New Roman" w:hAnsi="Times New Roman"/>
+                <w:b w:val="0"/>
+                <w:sz w:val="20"/>
+              </w:rPr>
+              <w:t>30</w:t>
+            </w:r>
+          </w:p>
+        </w:tc>
+      </w:tr>
+      <w:tr>
+        <w:tc>
+          <w:tcPr>
+            <w:tcW w:type="dxa" w:w="2197"/>
+          </w:tcPr>
+          <w:p>
+            <w:pPr>
+              <w:jc w:val="center"/>
+            </w:pPr>
+            <w:r/>
+            <w:r>
+              <w:rPr>
+                <w:rFonts w:ascii="Times New Roman" w:hAnsi="Times New Roman"/>
+                <w:b w:val="0"/>
+                <w:sz w:val="20"/>
+              </w:rPr>
+              <w:t>2</w:t>
+            </w:r>
+          </w:p>
+        </w:tc>
+        <w:tc>
+          <w:tcPr>
+            <w:tcW w:type="dxa" w:w="2197"/>
+          </w:tcPr>
+          <w:p>
+            <w:r/>
+            <w:r>
+              <w:rPr>
+                <w:rFonts w:ascii="Times New Roman" w:hAnsi="Times New Roman"/>
+                <w:b w:val="0"/>
+                <w:sz w:val="20"/>
+              </w:rPr>
+              <w:t>Skor Minimum</w:t>
+            </w:r>
+          </w:p>
+        </w:tc>
+        <w:tc>
+          <w:tcPr>
+            <w:tcW w:type="dxa" w:w="2197"/>
+          </w:tcPr>
+          <w:p>
+            <w:pPr>
+              <w:jc w:val="center"/>
+            </w:pPr>
+            <w:r/>
+            <w:r>
+              <w:rPr>
+                <w:rFonts w:ascii="Times New Roman" w:hAnsi="Times New Roman"/>
+                <w:b w:val="0"/>
+                <w:sz w:val="20"/>
+              </w:rPr>
+              <w:t>65,0</w:t>
+            </w:r>
+          </w:p>
+        </w:tc>
+        <w:tc>
+          <w:tcPr>
+            <w:tcW w:type="dxa" w:w="2197"/>
+          </w:tcPr>
+          <w:p>
+            <w:pPr>
+              <w:jc w:val="center"/>
+            </w:pPr>
+            <w:r/>
+            <w:r>
+              <w:rPr>
+                <w:rFonts w:ascii="Times New Roman" w:hAnsi="Times New Roman"/>
+                <w:b w:val="0"/>
+                <w:sz w:val="20"/>
+              </w:rPr>
+              <w:t>67,0</w:t>
+            </w:r>
+          </w:p>
+        </w:tc>
+      </w:tr>
+      <w:tr>
+        <w:tc>
+          <w:tcPr>
+            <w:tcW w:type="dxa" w:w="2197"/>
+          </w:tcPr>
+          <w:p>
+            <w:pPr>
+              <w:jc w:val="center"/>
+            </w:pPr>
+            <w:r/>
+            <w:r>
+              <w:rPr>
+                <w:rFonts w:ascii="Times New Roman" w:hAnsi="Times New Roman"/>
+                <w:b w:val="0"/>
+                <w:sz w:val="20"/>
+              </w:rPr>
+              <w:t>3</w:t>
+            </w:r>
+          </w:p>
+        </w:tc>
+        <w:tc>
+          <w:tcPr>
+            <w:tcW w:type="dxa" w:w="2197"/>
+          </w:tcPr>
+          <w:p>
+            <w:r/>
+            <w:r>
+              <w:rPr>
+                <w:rFonts w:ascii="Times New Roman" w:hAnsi="Times New Roman"/>
+                <w:b w:val="0"/>
+                <w:sz w:val="20"/>
+              </w:rPr>
+              <w:t>Skor Maksimum</w:t>
+            </w:r>
+          </w:p>
+        </w:tc>
+        <w:tc>
+          <w:tcPr>
+            <w:tcW w:type="dxa" w:w="2197"/>
+          </w:tcPr>
+          <w:p>
+            <w:pPr>
+              <w:jc w:val="center"/>
+            </w:pPr>
+            <w:r/>
+            <w:r>
+              <w:rPr>
+                <w:rFonts w:ascii="Times New Roman" w:hAnsi="Times New Roman"/>
+                <w:b w:val="0"/>
+                <w:sz w:val="20"/>
+              </w:rPr>
+              <w:t>92,0</w:t>
+            </w:r>
+          </w:p>
+        </w:tc>
+        <w:tc>
+          <w:tcPr>
+            <w:tcW w:type="dxa" w:w="2197"/>
+          </w:tcPr>
+          <w:p>
+            <w:pPr>
+              <w:jc w:val="center"/>
+            </w:pPr>
+            <w:r/>
+            <w:r>
+              <w:rPr>
+                <w:rFonts w:ascii="Times New Roman" w:hAnsi="Times New Roman"/>
+                <w:b w:val="0"/>
+                <w:sz w:val="20"/>
+              </w:rPr>
+              <w:t>100,0</w:t>
+            </w:r>
+          </w:p>
+        </w:tc>
+      </w:tr>
+      <w:tr>
+        <w:tc>
+          <w:tcPr>
+            <w:tcW w:type="dxa" w:w="2197"/>
+          </w:tcPr>
+          <w:p>
+            <w:pPr>
+              <w:jc w:val="center"/>
+            </w:pPr>
+            <w:r/>
+            <w:r>
+              <w:rPr>
+                <w:rFonts w:ascii="Times New Roman" w:hAnsi="Times New Roman"/>
+                <w:b w:val="0"/>
+                <w:sz w:val="20"/>
+              </w:rPr>
+              <w:t>4</w:t>
+            </w:r>
+          </w:p>
+        </w:tc>
+        <w:tc>
+          <w:tcPr>
+            <w:tcW w:type="dxa" w:w="2197"/>
+          </w:tcPr>
+          <w:p>
+            <w:r/>
+            <w:r>
+              <w:rPr>
+                <w:rFonts w:ascii="Times New Roman" w:hAnsi="Times New Roman"/>
+                <w:b w:val="0"/>
+                <w:sz w:val="20"/>
+              </w:rPr>
+              <w:t>Mean (Rata-rata)</w:t>
+            </w:r>
+          </w:p>
+        </w:tc>
+        <w:tc>
+          <w:tcPr>
+            <w:tcW w:type="dxa" w:w="2197"/>
+          </w:tcPr>
+          <w:p>
+            <w:pPr>
+              <w:jc w:val="center"/>
+            </w:pPr>
+            <w:r/>
+            <w:r>
+              <w:rPr>
+                <w:rFonts w:ascii="Times New Roman" w:hAnsi="Times New Roman"/>
+                <w:b w:val="0"/>
+                <w:sz w:val="20"/>
+              </w:rPr>
+              <w:t>78,400</w:t>
+            </w:r>
+          </w:p>
+        </w:tc>
+        <w:tc>
+          <w:tcPr>
+            <w:tcW w:type="dxa" w:w="2197"/>
+          </w:tcPr>
+          <w:p>
+            <w:pPr>
+              <w:jc w:val="center"/>
+            </w:pPr>
+            <w:r/>
+            <w:r>
+              <w:rPr>
+                <w:rFonts w:ascii="Times New Roman" w:hAnsi="Times New Roman"/>
+                <w:b w:val="0"/>
+                <w:sz w:val="20"/>
+              </w:rPr>
+              <w:t>83,000</w:t>
+            </w:r>
+          </w:p>
+        </w:tc>
+      </w:tr>
+      <w:tr>
+        <w:tc>
+          <w:tcPr>
+            <w:tcW w:type="dxa" w:w="2197"/>
+          </w:tcPr>
+          <w:p>
+            <w:pPr>
+              <w:jc w:val="center"/>
+            </w:pPr>
+            <w:r/>
+            <w:r>
+              <w:rPr>
+                <w:rFonts w:ascii="Times New Roman" w:hAnsi="Times New Roman"/>
+                <w:b w:val="0"/>
+                <w:sz w:val="20"/>
+              </w:rPr>
+              <w:t>5</w:t>
+            </w:r>
+          </w:p>
+        </w:tc>
+        <w:tc>
+          <w:tcPr>
+            <w:tcW w:type="dxa" w:w="2197"/>
+          </w:tcPr>
+          <w:p>
+            <w:r/>
+            <w:r>
+              <w:rPr>
+                <w:rFonts w:ascii="Times New Roman" w:hAnsi="Times New Roman"/>
+                <w:b w:val="0"/>
+                <w:sz w:val="20"/>
+              </w:rPr>
+              <w:t>Median</w:t>
+            </w:r>
+          </w:p>
+        </w:tc>
+        <w:tc>
+          <w:tcPr>
+            <w:tcW w:type="dxa" w:w="2197"/>
+          </w:tcPr>
+          <w:p>
+            <w:pPr>
+              <w:jc w:val="center"/>
+            </w:pPr>
+            <w:r/>
+            <w:r>
+              <w:rPr>
+                <w:rFonts w:ascii="Times New Roman" w:hAnsi="Times New Roman"/>
+                <w:b w:val="0"/>
+                <w:sz w:val="20"/>
+              </w:rPr>
+              <w:t>79,000</w:t>
+            </w:r>
+          </w:p>
+        </w:tc>
+        <w:tc>
+          <w:tcPr>
+            <w:tcW w:type="dxa" w:w="2197"/>
+          </w:tcPr>
+          <w:p>
+            <w:pPr>
+              <w:jc w:val="center"/>
+            </w:pPr>
+            <w:r/>
+            <w:r>
+              <w:rPr>
+                <w:rFonts w:ascii="Times New Roman" w:hAnsi="Times New Roman"/>
+                <w:b w:val="0"/>
+                <w:sz w:val="20"/>
+              </w:rPr>
+              <w:t>80,000</w:t>
+            </w:r>
+          </w:p>
+        </w:tc>
+      </w:tr>
+      <w:tr>
+        <w:tc>
+          <w:tcPr>
+            <w:tcW w:type="dxa" w:w="2197"/>
+          </w:tcPr>
+          <w:p>
+            <w:pPr>
+              <w:jc w:val="center"/>
+            </w:pPr>
+            <w:r/>
+            <w:r>
+              <w:rPr>
+                <w:rFonts w:ascii="Times New Roman" w:hAnsi="Times New Roman"/>
+                <w:b w:val="0"/>
+                <w:sz w:val="20"/>
+              </w:rPr>
+              <w:t>6</w:t>
+            </w:r>
+          </w:p>
+        </w:tc>
+        <w:tc>
+          <w:tcPr>
+            <w:tcW w:type="dxa" w:w="2197"/>
+          </w:tcPr>
+          <w:p>
+            <w:r/>
+            <w:r>
+              <w:rPr>
+                <w:rFonts w:ascii="Times New Roman" w:hAnsi="Times New Roman"/>
+                <w:b w:val="0"/>
+                <w:sz w:val="20"/>
+              </w:rPr>
+              <w:t>Standar Deviasi (SD)</w:t>
+            </w:r>
+          </w:p>
+        </w:tc>
+        <w:tc>
+          <w:tcPr>
+            <w:tcW w:type="dxa" w:w="2197"/>
+          </w:tcPr>
+          <w:p>
+            <w:pPr>
+              <w:jc w:val="center"/>
+            </w:pPr>
+            <w:r/>
+            <w:r>
+              <w:rPr>
+                <w:rFonts w:ascii="Times New Roman" w:hAnsi="Times New Roman"/>
+                <w:b w:val="0"/>
+                <w:sz w:val="20"/>
+              </w:rPr>
+              <w:t>8,126</w:t>
+            </w:r>
+          </w:p>
+        </w:tc>
+        <w:tc>
+          <w:tcPr>
+            <w:tcW w:type="dxa" w:w="2197"/>
+          </w:tcPr>
+          <w:p>
+            <w:pPr>
+              <w:jc w:val="center"/>
+            </w:pPr>
+            <w:r/>
+            <w:r>
+              <w:rPr>
+                <w:rFonts w:ascii="Times New Roman" w:hAnsi="Times New Roman"/>
+                <w:b w:val="0"/>
+                <w:sz w:val="20"/>
+              </w:rPr>
+              <w:t>8,263</w:t>
+            </w:r>
+          </w:p>
+        </w:tc>
+      </w:tr>
+      <w:tr>
+        <w:tc>
+          <w:tcPr>
+            <w:tcW w:type="dxa" w:w="2197"/>
+          </w:tcPr>
+          <w:p>
+            <w:pPr>
+              <w:jc w:val="center"/>
+            </w:pPr>
+            <w:r/>
+            <w:r>
+              <w:rPr>
+                <w:rFonts w:ascii="Times New Roman" w:hAnsi="Times New Roman"/>
+                <w:b w:val="0"/>
+                <w:sz w:val="20"/>
+              </w:rPr>
+              <w:t>7</w:t>
+            </w:r>
+          </w:p>
+        </w:tc>
+        <w:tc>
+          <w:tcPr>
+            <w:tcW w:type="dxa" w:w="2197"/>
+          </w:tcPr>
+          <w:p>
+            <w:r/>
+            <w:r>
+              <w:rPr>
+                <w:rFonts w:ascii="Times New Roman" w:hAnsi="Times New Roman"/>
+                <w:b w:val="0"/>
+                <w:sz w:val="20"/>
+              </w:rPr>
+              <w:t>Varians</w:t>
+            </w:r>
+          </w:p>
+        </w:tc>
+        <w:tc>
+          <w:tcPr>
+            <w:tcW w:type="dxa" w:w="2197"/>
+          </w:tcPr>
+          <w:p>
+            <w:pPr>
+              <w:jc w:val="center"/>
+            </w:pPr>
+            <w:r/>
+            <w:r>
+              <w:rPr>
+                <w:rFonts w:ascii="Times New Roman" w:hAnsi="Times New Roman"/>
+                <w:b w:val="0"/>
+                <w:sz w:val="20"/>
+              </w:rPr>
+              <w:t>66,044</w:t>
+            </w:r>
+          </w:p>
+        </w:tc>
+        <w:tc>
+          <w:tcPr>
+            <w:tcW w:type="dxa" w:w="2197"/>
+          </w:tcPr>
+          <w:p>
+            <w:pPr>
+              <w:jc w:val="center"/>
+            </w:pPr>
+            <w:r/>
+            <w:r>
+              <w:rPr>
+                <w:rFonts w:ascii="Times New Roman" w:hAnsi="Times New Roman"/>
+                <w:b w:val="0"/>
+                <w:sz w:val="20"/>
+              </w:rPr>
+              <w:t>68,276</w:t>
+            </w:r>
+          </w:p>
+        </w:tc>
+      </w:tr>
+      <w:tr>
+        <w:tc>
+          <w:tcPr>
+            <w:tcW w:type="dxa" w:w="2197"/>
+          </w:tcPr>
+          <w:p>
+            <w:pPr>
+              <w:jc w:val="center"/>
+            </w:pPr>
+            <w:r/>
+            <w:r>
+              <w:rPr>
+                <w:rFonts w:ascii="Times New Roman" w:hAnsi="Times New Roman"/>
+                <w:b w:val="0"/>
+                <w:sz w:val="20"/>
+              </w:rPr>
+              <w:t>8</w:t>
+            </w:r>
+          </w:p>
+        </w:tc>
+        <w:tc>
+          <w:tcPr>
+            <w:tcW w:type="dxa" w:w="2197"/>
+          </w:tcPr>
+          <w:p>
+            <w:r/>
+            <w:r>
+              <w:rPr>
+                <w:rFonts w:ascii="Times New Roman" w:hAnsi="Times New Roman"/>
+                <w:b w:val="0"/>
+                <w:sz w:val="20"/>
+              </w:rPr>
+              <w:t>Skewness</w:t>
+            </w:r>
+          </w:p>
+        </w:tc>
+        <w:tc>
+          <w:tcPr>
+            <w:tcW w:type="dxa" w:w="2197"/>
+          </w:tcPr>
+          <w:p>
+            <w:pPr>
+              <w:jc w:val="center"/>
+            </w:pPr>
+            <w:r/>
+            <w:r>
+              <w:rPr>
+                <w:rFonts w:ascii="Times New Roman" w:hAnsi="Times New Roman"/>
+                <w:b w:val="0"/>
+                <w:sz w:val="20"/>
+              </w:rPr>
+              <w:t>-0,215</w:t>
+            </w:r>
+          </w:p>
+        </w:tc>
+        <w:tc>
+          <w:tcPr>
+            <w:tcW w:type="dxa" w:w="2197"/>
+          </w:tcPr>
+          <w:p>
+            <w:pPr>
+              <w:jc w:val="center"/>
+            </w:pPr>
+            <w:r/>
+            <w:r>
+              <w:rPr>
+                <w:rFonts w:ascii="Times New Roman" w:hAnsi="Times New Roman"/>
+                <w:b w:val="0"/>
+                <w:sz w:val="20"/>
+              </w:rPr>
+              <w:t>0,326</w:t>
+            </w:r>
+          </w:p>
+        </w:tc>
+      </w:tr>
+      <w:tr>
+        <w:tc>
+          <w:tcPr>
+            <w:tcW w:type="dxa" w:w="2197"/>
+          </w:tcPr>
+          <w:p>
+            <w:pPr>
+              <w:jc w:val="center"/>
+            </w:pPr>
+            <w:r/>
+            <w:r>
+              <w:rPr>
+                <w:rFonts w:ascii="Times New Roman" w:hAnsi="Times New Roman"/>
+                <w:b w:val="0"/>
+                <w:sz w:val="20"/>
+              </w:rPr>
+              <w:t>9</w:t>
+            </w:r>
+          </w:p>
+        </w:tc>
+        <w:tc>
+          <w:tcPr>
+            <w:tcW w:type="dxa" w:w="2197"/>
+          </w:tcPr>
+          <w:p>
+            <w:r/>
+            <w:r>
+              <w:rPr>
+                <w:rFonts w:ascii="Times New Roman" w:hAnsi="Times New Roman"/>
+                <w:b w:val="0"/>
+                <w:sz w:val="20"/>
+              </w:rPr>
+              <w:t>Rentang (Range)</w:t>
+            </w:r>
+          </w:p>
+        </w:tc>
+        <w:tc>
+          <w:tcPr>
+            <w:tcW w:type="dxa" w:w="2197"/>
+          </w:tcPr>
+          <w:p>
+            <w:pPr>
+              <w:jc w:val="center"/>
+            </w:pPr>
+            <w:r/>
+            <w:r>
+              <w:rPr>
+                <w:rFonts w:ascii="Times New Roman" w:hAnsi="Times New Roman"/>
+                <w:b w:val="0"/>
+                <w:sz w:val="20"/>
+              </w:rPr>
+              <w:t>27,0</w:t>
+            </w:r>
+          </w:p>
+        </w:tc>
+        <w:tc>
+          <w:tcPr>
+            <w:tcW w:type="dxa" w:w="2197"/>
+          </w:tcPr>
+          <w:p>
+            <w:pPr>
+              <w:jc w:val="center"/>
+            </w:pPr>
+            <w:r/>
+            <w:r>
+              <w:rPr>
+                <w:rFonts w:ascii="Times New Roman" w:hAnsi="Times New Roman"/>
+                <w:b w:val="0"/>
+                <w:sz w:val="20"/>
+              </w:rPr>
+              <w:t>33,0</w:t>
+            </w:r>
+          </w:p>
+        </w:tc>
+      </w:tr>
+      <w:tr>
+        <w:tc>
+          <w:tcPr>
+            <w:tcW w:type="dxa" w:w="2197"/>
+          </w:tcPr>
+          <w:p>
+            <w:pPr>
+              <w:jc w:val="center"/>
+            </w:pPr>
+            <w:r/>
+            <w:r>
+              <w:rPr>
+                <w:rFonts w:ascii="Times New Roman" w:hAnsi="Times New Roman"/>
+                <w:b w:val="0"/>
+                <w:sz w:val="20"/>
+              </w:rPr>
+              <w:t>10</w:t>
+            </w:r>
+          </w:p>
+        </w:tc>
+        <w:tc>
+          <w:tcPr>
+            <w:tcW w:type="dxa" w:w="2197"/>
+          </w:tcPr>
+          <w:p>
+            <w:r/>
+            <w:r>
+              <w:rPr>
+                <w:rFonts w:ascii="Times New Roman" w:hAnsi="Times New Roman"/>
+                <w:b w:val="0"/>
+                <w:sz w:val="20"/>
+              </w:rPr>
+              <w:t>Persentase Ketuntasan (≥75)</w:t>
+            </w:r>
+          </w:p>
+        </w:tc>
+        <w:tc>
+          <w:tcPr>
+            <w:tcW w:type="dxa" w:w="2197"/>
+          </w:tcPr>
+          <w:p>
+            <w:pPr>
+              <w:jc w:val="center"/>
+            </w:pPr>
+            <w:r/>
+            <w:r>
+              <w:rPr>
+                <w:rFonts w:ascii="Times New Roman" w:hAnsi="Times New Roman"/>
+                <w:b w:val="0"/>
+                <w:sz w:val="20"/>
+              </w:rPr>
+              <w:t>70%</w:t>
+            </w:r>
+          </w:p>
+        </w:tc>
+        <w:tc>
+          <w:tcPr>
+            <w:tcW w:type="dxa" w:w="2197"/>
+          </w:tcPr>
+          <w:p>
+            <w:pPr>
+              <w:jc w:val="center"/>
+            </w:pPr>
+            <w:r/>
+            <w:r>
+              <w:rPr>
+                <w:rFonts w:ascii="Times New Roman" w:hAnsi="Times New Roman"/>
+                <w:b w:val="0"/>
+                <w:sz w:val="20"/>
+              </w:rPr>
+              <w:t>83,3%</w:t>
+            </w:r>
+          </w:p>
+        </w:tc>
+      </w:tr>
+      <w:tr>
+        <w:tc>
+          <w:tcPr>
+            <w:tcW w:type="dxa" w:w="2197"/>
+          </w:tcPr>
+          <w:p>
+            <w:pPr>
+              <w:jc w:val="center"/>
+            </w:pPr>
+            <w:r/>
+            <w:r>
+              <w:rPr>
+                <w:rFonts w:ascii="Times New Roman" w:hAnsi="Times New Roman"/>
+                <w:b w:val="0"/>
+                <w:sz w:val="20"/>
+              </w:rPr>
+              <w:t>11</w:t>
+            </w:r>
+          </w:p>
+        </w:tc>
+        <w:tc>
+          <w:tcPr>
+            <w:tcW w:type="dxa" w:w="2197"/>
+          </w:tcPr>
+          <w:p>
+            <w:r/>
+            <w:r>
+              <w:rPr>
+                <w:rFonts w:ascii="Times New Roman" w:hAnsi="Times New Roman"/>
+                <w:b w:val="0"/>
+                <w:sz w:val="20"/>
+              </w:rPr>
+              <w:t>Kategori Peningkatan</w:t>
+            </w:r>
+          </w:p>
+        </w:tc>
+        <w:tc>
+          <w:tcPr>
+            <w:tcW w:type="dxa" w:w="2197"/>
+          </w:tcPr>
+          <w:p>
+            <w:pPr>
+              <w:jc w:val="center"/>
+            </w:pPr>
+            <w:r/>
+            <w:r>
+              <w:rPr>
+                <w:rFonts w:ascii="Times New Roman" w:hAnsi="Times New Roman"/>
+                <w:b w:val="0"/>
+                <w:sz w:val="20"/>
+              </w:rPr>
+              <w:t>Cukup Baik</w:t>
+            </w:r>
+          </w:p>
+        </w:tc>
+        <w:tc>
+          <w:tcPr>
+            <w:tcW w:type="dxa" w:w="2197"/>
+          </w:tcPr>
+          <w:p>
+            <w:pPr>
+              <w:jc w:val="center"/>
+            </w:pPr>
+            <w:r/>
+            <w:r>
+              <w:rPr>
+                <w:rFonts w:ascii="Times New Roman" w:hAnsi="Times New Roman"/>
+                <w:b w:val="0"/>
+                <w:sz w:val="20"/>
+              </w:rPr>
+              <w:t>Baik</w:t>
+            </w:r>
+          </w:p>
+        </w:tc>
+      </w:tr>
+    </w:tbl>
+    <w:p>
+      <w:r>
+        <w:rPr>
+          <w:rFonts w:ascii="Times New Roman" w:hAnsi="Times New Roman"/>
+          <w:i/>
+          <w:sz w:val="18"/>
+        </w:rPr>
+        <w:t>Catatan: Skor berdasarkan instrumen tes kemampuan kolaborasi siswa setelah penggunaan e-modul berbantuan Canva Plus dengan pendekatan PjBL.</w:t>
+      </w:r>
+    </w:p>
+    <w:p/>
+    <w:p/>
+    <w:p>
+      <w:pPr>
+        <w:jc w:val="center"/>
+      </w:pPr>
+      <w:r>
+        <w:rPr>
+          <w:rFonts w:ascii="Times New Roman" w:hAnsi="Times New Roman"/>
+          <w:b/>
+          <w:sz w:val="20"/>
+        </w:rPr>
+        <w:t>Tabel 11. Rekapitulasi Hasil Angket Respon Siswa pada Uji Coba Terbatas (10 Siswa) dan Uji Coba Luas (30 Siswa)</w:t>
+      </w:r>
+    </w:p>
+    <w:tbl>
+      <w:tblPr>
+        <w:tblStyle w:val="KisiTabel"/>
+        <w:tblW w:type="auto" w:w="0"/>
+        <w:tblLook w:firstColumn="1" w:firstRow="1" w:lastColumn="0" w:lastRow="0" w:noHBand="0" w:noVBand="1" w:val="04A0"/>
+      </w:tblPr>
+      <w:tblGrid>
+        <w:gridCol w:w="1758"/>
+        <w:gridCol w:w="1758"/>
+        <w:gridCol w:w="1758"/>
+        <w:gridCol w:w="1758"/>
+        <w:gridCol w:w="1758"/>
+      </w:tblGrid>
+      <w:tr>
+        <w:tc>
+          <w:tcPr>
+            <w:tcW w:type="dxa" w:w="1758"/>
+          </w:tcPr>
+          <w:p>
+            <w:pPr>
+              <w:jc w:val="center"/>
+            </w:pPr>
+            <w:r/>
+            <w:r>
+              <w:rPr>
+                <w:rFonts w:ascii="Times New Roman" w:hAnsi="Times New Roman"/>
+                <w:b/>
+                <w:sz w:val="20"/>
+              </w:rPr>
+              <w:t>No.</w:t>
+            </w:r>
+          </w:p>
+        </w:tc>
+        <w:tc>
+          <w:tcPr>
+            <w:tcW w:type="dxa" w:w="1758"/>
+          </w:tcPr>
+          <w:p>
+            <w:pPr>
+              <w:jc w:val="center"/>
+            </w:pPr>
+            <w:r/>
+            <w:r>
+              <w:rPr>
+                <w:rFonts w:ascii="Times New Roman" w:hAnsi="Times New Roman"/>
+                <w:b/>
+                <w:sz w:val="20"/>
+              </w:rPr>
+              <w:t>Aspek Penilaian</w:t>
+            </w:r>
+          </w:p>
+        </w:tc>
+        <w:tc>
+          <w:tcPr>
+            <w:tcW w:type="dxa" w:w="1758"/>
+          </w:tcPr>
+          <w:p>
+            <w:pPr>
+              <w:jc w:val="center"/>
+            </w:pPr>
+            <w:r/>
+            <w:r>
+              <w:rPr>
+                <w:rFonts w:ascii="Times New Roman" w:hAnsi="Times New Roman"/>
+                <w:b/>
+                <w:sz w:val="20"/>
+              </w:rPr>
+              <w:t>Uji Terbatas</w:t>
+              <w:br/>
+              <w:t>(n = 10)</w:t>
+            </w:r>
+          </w:p>
+        </w:tc>
+        <w:tc>
+          <w:tcPr>
+            <w:tcW w:type="dxa" w:w="1758"/>
+          </w:tcPr>
+          <w:p>
+            <w:pPr>
+              <w:jc w:val="center"/>
+            </w:pPr>
+            <w:r/>
+            <w:r>
+              <w:rPr>
+                <w:rFonts w:ascii="Times New Roman" w:hAnsi="Times New Roman"/>
+                <w:b/>
+                <w:sz w:val="20"/>
+              </w:rPr>
+              <w:t>Uji Luas</w:t>
+              <w:br/>
+              <w:t>(n = 30)</w:t>
+            </w:r>
+          </w:p>
+        </w:tc>
+        <w:tc>
+          <w:tcPr>
+            <w:tcW w:type="dxa" w:w="1758"/>
+          </w:tcPr>
+          <w:p>
+            <w:pPr>
+              <w:jc w:val="center"/>
+            </w:pPr>
+            <w:r/>
+            <w:r>
+              <w:rPr>
+                <w:rFonts w:ascii="Times New Roman" w:hAnsi="Times New Roman"/>
+                <w:b/>
+                <w:sz w:val="20"/>
+              </w:rPr>
+              <w:t>Kategori</w:t>
+            </w:r>
+          </w:p>
+        </w:tc>
+      </w:tr>
+      <w:tr>
+        <w:tc>
+          <w:tcPr>
+            <w:tcW w:type="dxa" w:w="1758"/>
+          </w:tcPr>
+          <w:p>
+            <w:pPr>
+              <w:jc w:val="center"/>
+            </w:pPr>
+            <w:r/>
+            <w:r>
+              <w:rPr>
+                <w:rFonts w:ascii="Times New Roman" w:hAnsi="Times New Roman"/>
+                <w:b w:val="0"/>
+                <w:sz w:val="20"/>
+              </w:rPr>
+              <w:t>1</w:t>
+            </w:r>
+          </w:p>
+        </w:tc>
+        <w:tc>
+          <w:tcPr>
+            <w:tcW w:type="dxa" w:w="1758"/>
+          </w:tcPr>
+          <w:p>
+            <w:r/>
+            <w:r>
+              <w:rPr>
+                <w:rFonts w:ascii="Times New Roman" w:hAnsi="Times New Roman"/>
+                <w:b w:val="0"/>
+                <w:sz w:val="20"/>
+              </w:rPr>
+              <w:t>Kemudahan penggunaan e-modul</w:t>
+            </w:r>
+          </w:p>
+        </w:tc>
+        <w:tc>
+          <w:tcPr>
+            <w:tcW w:type="dxa" w:w="1758"/>
+          </w:tcPr>
+          <w:p>
+            <w:pPr>
+              <w:jc w:val="center"/>
+            </w:pPr>
+            <w:r/>
+            <w:r>
+              <w:rPr>
+                <w:rFonts w:ascii="Times New Roman" w:hAnsi="Times New Roman"/>
+                <w:b w:val="0"/>
+                <w:sz w:val="20"/>
+              </w:rPr>
+              <w:t>84%</w:t>
+            </w:r>
+          </w:p>
+        </w:tc>
+        <w:tc>
+          <w:tcPr>
+            <w:tcW w:type="dxa" w:w="1758"/>
+          </w:tcPr>
+          <w:p>
+            <w:pPr>
+              <w:jc w:val="center"/>
+            </w:pPr>
+            <w:r/>
+            <w:r>
+              <w:rPr>
+                <w:rFonts w:ascii="Times New Roman" w:hAnsi="Times New Roman"/>
+                <w:b w:val="0"/>
+                <w:sz w:val="20"/>
+              </w:rPr>
+              <w:t>86%</w:t>
+            </w:r>
+          </w:p>
+        </w:tc>
+        <w:tc>
+          <w:tcPr>
+            <w:tcW w:type="dxa" w:w="1758"/>
+          </w:tcPr>
+          <w:p>
+            <w:pPr>
+              <w:jc w:val="center"/>
+            </w:pPr>
+            <w:r/>
+            <w:r>
+              <w:rPr>
+                <w:rFonts w:ascii="Times New Roman" w:hAnsi="Times New Roman"/>
+                <w:b w:val="0"/>
+                <w:sz w:val="20"/>
+              </w:rPr>
+              <w:t>Sangat Praktis</w:t>
+            </w:r>
+          </w:p>
+        </w:tc>
+      </w:tr>
+      <w:tr>
+        <w:tc>
+          <w:tcPr>
+            <w:tcW w:type="dxa" w:w="1758"/>
+          </w:tcPr>
+          <w:p>
+            <w:pPr>
+              <w:jc w:val="center"/>
+            </w:pPr>
+            <w:r/>
+            <w:r>
+              <w:rPr>
+                <w:rFonts w:ascii="Times New Roman" w:hAnsi="Times New Roman"/>
+                <w:b w:val="0"/>
+                <w:sz w:val="20"/>
+              </w:rPr>
+              <w:t>2</w:t>
+            </w:r>
+          </w:p>
+        </w:tc>
+        <w:tc>
+          <w:tcPr>
+            <w:tcW w:type="dxa" w:w="1758"/>
+          </w:tcPr>
+          <w:p>
+            <w:r/>
+            <w:r>
+              <w:rPr>
+                <w:rFonts w:ascii="Times New Roman" w:hAnsi="Times New Roman"/>
+                <w:b w:val="0"/>
+                <w:sz w:val="20"/>
+              </w:rPr>
+              <w:t>Ketertarikan terhadap tampilan visual</w:t>
+            </w:r>
+          </w:p>
+        </w:tc>
+        <w:tc>
+          <w:tcPr>
+            <w:tcW w:type="dxa" w:w="1758"/>
+          </w:tcPr>
+          <w:p>
+            <w:pPr>
+              <w:jc w:val="center"/>
+            </w:pPr>
+            <w:r/>
+            <w:r>
+              <w:rPr>
+                <w:rFonts w:ascii="Times New Roman" w:hAnsi="Times New Roman"/>
+                <w:b w:val="0"/>
+                <w:sz w:val="20"/>
+              </w:rPr>
+              <w:t>88%</w:t>
+            </w:r>
+          </w:p>
+        </w:tc>
+        <w:tc>
+          <w:tcPr>
+            <w:tcW w:type="dxa" w:w="1758"/>
+          </w:tcPr>
+          <w:p>
+            <w:pPr>
+              <w:jc w:val="center"/>
+            </w:pPr>
+            <w:r/>
+            <w:r>
+              <w:rPr>
+                <w:rFonts w:ascii="Times New Roman" w:hAnsi="Times New Roman"/>
+                <w:b w:val="0"/>
+                <w:sz w:val="20"/>
+              </w:rPr>
+              <w:t>90%</w:t>
+            </w:r>
+          </w:p>
+        </w:tc>
+        <w:tc>
+          <w:tcPr>
+            <w:tcW w:type="dxa" w:w="1758"/>
+          </w:tcPr>
+          <w:p>
+            <w:pPr>
+              <w:jc w:val="center"/>
+            </w:pPr>
+            <w:r/>
+            <w:r>
+              <w:rPr>
+                <w:rFonts w:ascii="Times New Roman" w:hAnsi="Times New Roman"/>
+                <w:b w:val="0"/>
+                <w:sz w:val="20"/>
+              </w:rPr>
+              <w:t>Sangat Praktis</w:t>
+            </w:r>
+          </w:p>
+        </w:tc>
+      </w:tr>
+      <w:tr>
+        <w:tc>
+          <w:tcPr>
+            <w:tcW w:type="dxa" w:w="1758"/>
+          </w:tcPr>
+          <w:p>
+            <w:pPr>
+              <w:jc w:val="center"/>
+            </w:pPr>
+            <w:r/>
+            <w:r>
+              <w:rPr>
+                <w:rFonts w:ascii="Times New Roman" w:hAnsi="Times New Roman"/>
+                <w:b w:val="0"/>
+                <w:sz w:val="20"/>
+              </w:rPr>
+              <w:t>3</w:t>
+            </w:r>
+          </w:p>
+        </w:tc>
+        <w:tc>
+          <w:tcPr>
+            <w:tcW w:type="dxa" w:w="1758"/>
+          </w:tcPr>
+          <w:p>
+            <w:r/>
+            <w:r>
+              <w:rPr>
+                <w:rFonts w:ascii="Times New Roman" w:hAnsi="Times New Roman"/>
+                <w:b w:val="0"/>
+                <w:sz w:val="20"/>
+              </w:rPr>
+              <w:t>Kemudahan memahami materi IPAS</w:t>
+            </w:r>
+          </w:p>
+        </w:tc>
+        <w:tc>
+          <w:tcPr>
+            <w:tcW w:type="dxa" w:w="1758"/>
+          </w:tcPr>
+          <w:p>
+            <w:pPr>
+              <w:jc w:val="center"/>
+            </w:pPr>
+            <w:r/>
+            <w:r>
+              <w:rPr>
+                <w:rFonts w:ascii="Times New Roman" w:hAnsi="Times New Roman"/>
+                <w:b w:val="0"/>
+                <w:sz w:val="20"/>
+              </w:rPr>
+              <w:t>82%</w:t>
+            </w:r>
+          </w:p>
+        </w:tc>
+        <w:tc>
+          <w:tcPr>
+            <w:tcW w:type="dxa" w:w="1758"/>
+          </w:tcPr>
+          <w:p>
+            <w:pPr>
+              <w:jc w:val="center"/>
+            </w:pPr>
+            <w:r/>
+            <w:r>
+              <w:rPr>
+                <w:rFonts w:ascii="Times New Roman" w:hAnsi="Times New Roman"/>
+                <w:b w:val="0"/>
+                <w:sz w:val="20"/>
+              </w:rPr>
+              <w:t>85%</w:t>
+            </w:r>
+          </w:p>
+        </w:tc>
+        <w:tc>
+          <w:tcPr>
+            <w:tcW w:type="dxa" w:w="1758"/>
+          </w:tcPr>
+          <w:p>
+            <w:pPr>
+              <w:jc w:val="center"/>
+            </w:pPr>
+            <w:r/>
+            <w:r>
+              <w:rPr>
+                <w:rFonts w:ascii="Times New Roman" w:hAnsi="Times New Roman"/>
+                <w:b w:val="0"/>
+                <w:sz w:val="20"/>
+              </w:rPr>
+              <w:t>Sangat Praktis</w:t>
+            </w:r>
+          </w:p>
+        </w:tc>
+      </w:tr>
+      <w:tr>
+        <w:tc>
+          <w:tcPr>
+            <w:tcW w:type="dxa" w:w="1758"/>
+          </w:tcPr>
+          <w:p>
+            <w:pPr>
+              <w:jc w:val="center"/>
+            </w:pPr>
+            <w:r/>
+            <w:r>
+              <w:rPr>
+                <w:rFonts w:ascii="Times New Roman" w:hAnsi="Times New Roman"/>
+                <w:b w:val="0"/>
+                <w:sz w:val="20"/>
+              </w:rPr>
+              <w:t>4</w:t>
+            </w:r>
+          </w:p>
+        </w:tc>
+        <w:tc>
+          <w:tcPr>
+            <w:tcW w:type="dxa" w:w="1758"/>
+          </w:tcPr>
+          <w:p>
+            <w:r/>
+            <w:r>
+              <w:rPr>
+                <w:rFonts w:ascii="Times New Roman" w:hAnsi="Times New Roman"/>
+                <w:b w:val="0"/>
+                <w:sz w:val="20"/>
+              </w:rPr>
+              <w:t>Kejelasan instruksi kegiatan proyek (PjBL)</w:t>
+            </w:r>
+          </w:p>
+        </w:tc>
+        <w:tc>
+          <w:tcPr>
+            <w:tcW w:type="dxa" w:w="1758"/>
+          </w:tcPr>
+          <w:p>
+            <w:pPr>
+              <w:jc w:val="center"/>
+            </w:pPr>
+            <w:r/>
+            <w:r>
+              <w:rPr>
+                <w:rFonts w:ascii="Times New Roman" w:hAnsi="Times New Roman"/>
+                <w:b w:val="0"/>
+                <w:sz w:val="20"/>
+              </w:rPr>
+              <w:t>80%</w:t>
+            </w:r>
+          </w:p>
+        </w:tc>
+        <w:tc>
+          <w:tcPr>
+            <w:tcW w:type="dxa" w:w="1758"/>
+          </w:tcPr>
+          <w:p>
+            <w:pPr>
+              <w:jc w:val="center"/>
+            </w:pPr>
+            <w:r/>
+            <w:r>
+              <w:rPr>
+                <w:rFonts w:ascii="Times New Roman" w:hAnsi="Times New Roman"/>
+                <w:b w:val="0"/>
+                <w:sz w:val="20"/>
+              </w:rPr>
+              <w:t>84%</w:t>
+            </w:r>
+          </w:p>
+        </w:tc>
+        <w:tc>
+          <w:tcPr>
+            <w:tcW w:type="dxa" w:w="1758"/>
+          </w:tcPr>
+          <w:p>
+            <w:pPr>
+              <w:jc w:val="center"/>
+            </w:pPr>
+            <w:r/>
+            <w:r>
+              <w:rPr>
+                <w:rFonts w:ascii="Times New Roman" w:hAnsi="Times New Roman"/>
+                <w:b w:val="0"/>
+                <w:sz w:val="20"/>
+              </w:rPr>
+              <w:t>Sangat Praktis</w:t>
+            </w:r>
+          </w:p>
+        </w:tc>
+      </w:tr>
+      <w:tr>
+        <w:tc>
+          <w:tcPr>
+            <w:tcW w:type="dxa" w:w="1758"/>
+          </w:tcPr>
+          <w:p>
+            <w:pPr>
+              <w:jc w:val="center"/>
+            </w:pPr>
+            <w:r/>
+            <w:r>
+              <w:rPr>
+                <w:rFonts w:ascii="Times New Roman" w:hAnsi="Times New Roman"/>
+                <w:b w:val="0"/>
+                <w:sz w:val="20"/>
+              </w:rPr>
+              <w:t>5</w:t>
+            </w:r>
+          </w:p>
+        </w:tc>
+        <w:tc>
+          <w:tcPr>
+            <w:tcW w:type="dxa" w:w="1758"/>
+          </w:tcPr>
+          <w:p>
+            <w:r/>
+            <w:r>
+              <w:rPr>
+                <w:rFonts w:ascii="Times New Roman" w:hAnsi="Times New Roman"/>
+                <w:b w:val="0"/>
+                <w:sz w:val="20"/>
+              </w:rPr>
+              <w:t>Motivasi belajar setelah menggunakan e-modul</w:t>
+            </w:r>
+          </w:p>
+        </w:tc>
+        <w:tc>
+          <w:tcPr>
+            <w:tcW w:type="dxa" w:w="1758"/>
+          </w:tcPr>
+          <w:p>
+            <w:pPr>
+              <w:jc w:val="center"/>
+            </w:pPr>
+            <w:r/>
+            <w:r>
+              <w:rPr>
+                <w:rFonts w:ascii="Times New Roman" w:hAnsi="Times New Roman"/>
+                <w:b w:val="0"/>
+                <w:sz w:val="20"/>
+              </w:rPr>
+              <w:t>86%</w:t>
+            </w:r>
+          </w:p>
+        </w:tc>
+        <w:tc>
+          <w:tcPr>
+            <w:tcW w:type="dxa" w:w="1758"/>
+          </w:tcPr>
+          <w:p>
+            <w:pPr>
+              <w:jc w:val="center"/>
+            </w:pPr>
+            <w:r/>
+            <w:r>
+              <w:rPr>
+                <w:rFonts w:ascii="Times New Roman" w:hAnsi="Times New Roman"/>
+                <w:b w:val="0"/>
+                <w:sz w:val="20"/>
+              </w:rPr>
+              <w:t>89%</w:t>
+            </w:r>
+          </w:p>
+        </w:tc>
+        <w:tc>
+          <w:tcPr>
+            <w:tcW w:type="dxa" w:w="1758"/>
+          </w:tcPr>
+          <w:p>
+            <w:pPr>
+              <w:jc w:val="center"/>
+            </w:pPr>
+            <w:r/>
+            <w:r>
+              <w:rPr>
+                <w:rFonts w:ascii="Times New Roman" w:hAnsi="Times New Roman"/>
+                <w:b w:val="0"/>
+                <w:sz w:val="20"/>
+              </w:rPr>
+              <w:t>Sangat Praktis</w:t>
+            </w:r>
+          </w:p>
+        </w:tc>
+      </w:tr>
+      <w:tr>
+        <w:tc>
+          <w:tcPr>
+            <w:tcW w:type="dxa" w:w="1758"/>
+          </w:tcPr>
+          <w:p>
+            <w:pPr>
+              <w:jc w:val="center"/>
+            </w:pPr>
+            <w:r/>
+            <w:r>
+              <w:rPr>
+                <w:rFonts w:ascii="Times New Roman" w:hAnsi="Times New Roman"/>
+                <w:b w:val="0"/>
+                <w:sz w:val="20"/>
+              </w:rPr>
+              <w:t>6</w:t>
+            </w:r>
+          </w:p>
+        </w:tc>
+        <w:tc>
+          <w:tcPr>
+            <w:tcW w:type="dxa" w:w="1758"/>
+          </w:tcPr>
+          <w:p>
+            <w:r/>
+            <w:r>
+              <w:rPr>
+                <w:rFonts w:ascii="Times New Roman" w:hAnsi="Times New Roman"/>
+                <w:b w:val="0"/>
+                <w:sz w:val="20"/>
+              </w:rPr>
+              <w:t>Mendorong kerja sama dalam kelompok</w:t>
+            </w:r>
+          </w:p>
+        </w:tc>
+        <w:tc>
+          <w:tcPr>
+            <w:tcW w:type="dxa" w:w="1758"/>
+          </w:tcPr>
+          <w:p>
+            <w:pPr>
+              <w:jc w:val="center"/>
+            </w:pPr>
+            <w:r/>
+            <w:r>
+              <w:rPr>
+                <w:rFonts w:ascii="Times New Roman" w:hAnsi="Times New Roman"/>
+                <w:b w:val="0"/>
+                <w:sz w:val="20"/>
+              </w:rPr>
+              <w:t>83%</w:t>
+            </w:r>
+          </w:p>
+        </w:tc>
+        <w:tc>
+          <w:tcPr>
+            <w:tcW w:type="dxa" w:w="1758"/>
+          </w:tcPr>
+          <w:p>
+            <w:pPr>
+              <w:jc w:val="center"/>
+            </w:pPr>
+            <w:r/>
+            <w:r>
+              <w:rPr>
+                <w:rFonts w:ascii="Times New Roman" w:hAnsi="Times New Roman"/>
+                <w:b w:val="0"/>
+                <w:sz w:val="20"/>
+              </w:rPr>
+              <w:t>88%</w:t>
+            </w:r>
+          </w:p>
+        </w:tc>
+        <w:tc>
+          <w:tcPr>
+            <w:tcW w:type="dxa" w:w="1758"/>
+          </w:tcPr>
+          <w:p>
+            <w:pPr>
+              <w:jc w:val="center"/>
+            </w:pPr>
+            <w:r/>
+            <w:r>
+              <w:rPr>
+                <w:rFonts w:ascii="Times New Roman" w:hAnsi="Times New Roman"/>
+                <w:b w:val="0"/>
+                <w:sz w:val="20"/>
+              </w:rPr>
+              <w:t>Sangat Praktis</w:t>
+            </w:r>
+          </w:p>
+        </w:tc>
+      </w:tr>
+      <w:tr>
+        <w:tc>
+          <w:tcPr>
+            <w:tcW w:type="dxa" w:w="1758"/>
+          </w:tcPr>
+          <w:p>
+            <w:pPr>
+              <w:jc w:val="center"/>
+            </w:pPr>
+            <w:r/>
+            <w:r>
+              <w:rPr>
+                <w:rFonts w:ascii="Times New Roman" w:hAnsi="Times New Roman"/>
+                <w:b w:val="0"/>
+                <w:sz w:val="20"/>
+              </w:rPr>
+              <w:t>7</w:t>
+            </w:r>
+          </w:p>
+        </w:tc>
+        <w:tc>
+          <w:tcPr>
+            <w:tcW w:type="dxa" w:w="1758"/>
+          </w:tcPr>
+          <w:p>
+            <w:r/>
+            <w:r>
+              <w:rPr>
+                <w:rFonts w:ascii="Times New Roman" w:hAnsi="Times New Roman"/>
+                <w:b w:val="0"/>
+                <w:sz w:val="20"/>
+              </w:rPr>
+              <w:t>Kesesuaian waktu penyelesaian aktivitas</w:t>
+            </w:r>
+          </w:p>
+        </w:tc>
+        <w:tc>
+          <w:tcPr>
+            <w:tcW w:type="dxa" w:w="1758"/>
+          </w:tcPr>
+          <w:p>
+            <w:pPr>
+              <w:jc w:val="center"/>
+            </w:pPr>
+            <w:r/>
+            <w:r>
+              <w:rPr>
+                <w:rFonts w:ascii="Times New Roman" w:hAnsi="Times New Roman"/>
+                <w:b w:val="0"/>
+                <w:sz w:val="20"/>
+              </w:rPr>
+              <w:t>79%</w:t>
+            </w:r>
+          </w:p>
+        </w:tc>
+        <w:tc>
+          <w:tcPr>
+            <w:tcW w:type="dxa" w:w="1758"/>
+          </w:tcPr>
+          <w:p>
+            <w:pPr>
+              <w:jc w:val="center"/>
+            </w:pPr>
+            <w:r/>
+            <w:r>
+              <w:rPr>
+                <w:rFonts w:ascii="Times New Roman" w:hAnsi="Times New Roman"/>
+                <w:b w:val="0"/>
+                <w:sz w:val="20"/>
+              </w:rPr>
+              <w:t>82%</w:t>
+            </w:r>
+          </w:p>
+        </w:tc>
+        <w:tc>
+          <w:tcPr>
+            <w:tcW w:type="dxa" w:w="1758"/>
+          </w:tcPr>
+          <w:p>
+            <w:pPr>
+              <w:jc w:val="center"/>
+            </w:pPr>
+            <w:r/>
+            <w:r>
+              <w:rPr>
+                <w:rFonts w:ascii="Times New Roman" w:hAnsi="Times New Roman"/>
+                <w:b w:val="0"/>
+                <w:sz w:val="20"/>
+              </w:rPr>
+              <w:t>Praktis</w:t>
+            </w:r>
+          </w:p>
+        </w:tc>
+      </w:tr>
+      <w:tr>
+        <w:tc>
+          <w:tcPr>
+            <w:tcW w:type="dxa" w:w="1758"/>
+          </w:tcPr>
+          <w:p>
+            <w:pPr>
+              <w:jc w:val="center"/>
+            </w:pPr>
+            <w:r/>
+            <w:r>
+              <w:rPr>
+                <w:rFonts w:ascii="Times New Roman" w:hAnsi="Times New Roman"/>
+                <w:b/>
+                <w:sz w:val="20"/>
+              </w:rPr>
+            </w:r>
+          </w:p>
+        </w:tc>
+        <w:tc>
+          <w:tcPr>
+            <w:tcW w:type="dxa" w:w="1758"/>
+          </w:tcPr>
+          <w:p>
+            <w:r/>
+            <w:r>
+              <w:rPr>
+                <w:rFonts w:ascii="Times New Roman" w:hAnsi="Times New Roman"/>
+                <w:b/>
+                <w:sz w:val="20"/>
+              </w:rPr>
+              <w:t>Rata-rata Keseluruhan</w:t>
+            </w:r>
+          </w:p>
+        </w:tc>
+        <w:tc>
+          <w:tcPr>
+            <w:tcW w:type="dxa" w:w="1758"/>
+          </w:tcPr>
+          <w:p>
+            <w:pPr>
+              <w:jc w:val="center"/>
+            </w:pPr>
+            <w:r/>
+            <w:r>
+              <w:rPr>
+                <w:rFonts w:ascii="Times New Roman" w:hAnsi="Times New Roman"/>
+                <w:b/>
+                <w:sz w:val="20"/>
+              </w:rPr>
+              <w:t>83,1%</w:t>
+            </w:r>
+          </w:p>
+        </w:tc>
+        <w:tc>
+          <w:tcPr>
+            <w:tcW w:type="dxa" w:w="1758"/>
+          </w:tcPr>
+          <w:p>
+            <w:pPr>
+              <w:jc w:val="center"/>
+            </w:pPr>
+            <w:r/>
+            <w:r>
+              <w:rPr>
+                <w:rFonts w:ascii="Times New Roman" w:hAnsi="Times New Roman"/>
+                <w:b/>
+                <w:sz w:val="20"/>
+              </w:rPr>
+              <w:t>86,3%</w:t>
+            </w:r>
+          </w:p>
+        </w:tc>
+        <w:tc>
+          <w:tcPr>
+            <w:tcW w:type="dxa" w:w="1758"/>
+          </w:tcPr>
+          <w:p>
+            <w:pPr>
+              <w:jc w:val="center"/>
+            </w:pPr>
+            <w:r/>
+            <w:r>
+              <w:rPr>
+                <w:rFonts w:ascii="Times New Roman" w:hAnsi="Times New Roman"/>
+                <w:b/>
+                <w:sz w:val="20"/>
+              </w:rPr>
+              <w:t>Sangat Praktis</w:t>
+            </w:r>
+          </w:p>
+        </w:tc>
+      </w:tr>
+    </w:tbl>
+    <w:p>
+      <w:r>
+        <w:rPr>
+          <w:rFonts w:ascii="Times New Roman" w:hAnsi="Times New Roman"/>
+          <w:i/>
+          <w:sz w:val="18"/>
+        </w:rPr>
+        <w:t>Keterangan: Persentase dihitung berdasarkan skala Likert 1–4. Kategori: 0–20% (Sangat Tidak Praktis), 21–40% (Tidak Praktis), 41–60% (Cukup Praktis), 61–80% (Praktis), 81–100% (Sangat Praktis).</w:t>
+      </w:r>
+    </w:p>
     <w:sectPr>
       <w:pgSz w:w="11906" w:h="16838"/>
       <w:pgMar w:top="1417" w:right="1417" w:bottom="1417" w:left="1701" w:header="720" w:footer="720" w:gutter="0"/>

</xml_diff>